<commit_message>
Actualiza valores de salario y mejora el formato en los documentos de Otro Si Alimentacion
</commit_message>
<xml_diff>
--- a/webapp/templates/word/Otro_Si_Alimentacion_10.docx
+++ b/webapp/templates/word/Otro_Si_Alimentacion_10.docx
@@ -1,6 +1,6 @@
 
 <file path=word/document.xml><?xml version="1.0" encoding="utf-8"?>
-<w:document xmlns:wpc="http://schemas.microsoft.com/office/word/2010/wordprocessingCanvas" xmlns:cx="http://schemas.microsoft.com/office/drawing/2014/chartex" xmlns:cx1="http://schemas.microsoft.com/office/drawing/2015/9/8/chartex" xmlns:cx2="http://schemas.microsoft.com/office/drawing/2015/10/21/chartex" xmlns:cx3="http://schemas.microsoft.com/office/drawing/2016/5/9/chartex" xmlns:cx4="http://schemas.microsoft.com/office/drawing/2016/5/10/chartex" xmlns:cx5="http://schemas.microsoft.com/office/drawing/2016/5/11/chartex" xmlns:cx6="http://schemas.microsoft.com/office/drawing/2016/5/12/chartex" xmlns:cx7="http://schemas.microsoft.com/office/drawing/2016/5/13/chartex" xmlns:cx8="http://schemas.microsoft.com/office/drawing/2016/5/14/chartex" xmlns:mc="http://schemas.openxmlformats.org/markup-compatibility/2006" xmlns:aink="http://schemas.microsoft.com/office/drawing/2016/ink" xmlns:am3d="http://schemas.microsoft.com/office/drawing/2017/model3d" xmlns:o="urn:schemas-microsoft-com:office:office" xmlns:r="http://schemas.openxmlformats.org/officeDocument/2006/relationships" xmlns:m="http://schemas.openxmlformats.org/officeDocument/2006/math" xmlns:v="urn:schemas-microsoft-com:vml" xmlns:wp14="http://schemas.microsoft.com/office/word/2010/wordprocessingDrawing" xmlns:wp="http://schemas.openxmlformats.org/drawingml/2006/wordprocessingDrawing" xmlns:w10="urn:schemas-microsoft-com:office:word" xmlns:w="http://schemas.openxmlformats.org/wordprocessingml/2006/main" xmlns:w14="http://schemas.microsoft.com/office/word/2010/wordml" xmlns:w15="http://schemas.microsoft.com/office/word/2012/wordml" xmlns:w16cex="http://schemas.microsoft.com/office/word/2018/wordml/cex" xmlns:w16cid="http://schemas.microsoft.com/office/word/2016/wordml/cid" xmlns:w16="http://schemas.microsoft.com/office/word/2018/wordml" xmlns:w16sdtdh="http://schemas.microsoft.com/office/word/2020/wordml/sdtdatahash" xmlns:w16se="http://schemas.microsoft.com/office/word/2015/wordml/symex" xmlns:wpg="http://schemas.microsoft.com/office/word/2010/wordprocessingGroup" xmlns:wpi="http://schemas.microsoft.com/office/word/2010/wordprocessingInk" xmlns:wne="http://schemas.microsoft.com/office/word/2006/wordml" xmlns:wps="http://schemas.microsoft.com/office/word/2010/wordprocessingShape" mc:Ignorable="w14 w15 w16se w16cid w16 w16cex w16sdtdh wp14">
+<w:document xmlns:wpc="http://schemas.microsoft.com/office/word/2010/wordprocessingCanvas" xmlns:cx="http://schemas.microsoft.com/office/drawing/2014/chartex" xmlns:cx1="http://schemas.microsoft.com/office/drawing/2015/9/8/chartex" xmlns:cx2="http://schemas.microsoft.com/office/drawing/2015/10/21/chartex" xmlns:cx3="http://schemas.microsoft.com/office/drawing/2016/5/9/chartex" xmlns:cx4="http://schemas.microsoft.com/office/drawing/2016/5/10/chartex" xmlns:cx5="http://schemas.microsoft.com/office/drawing/2016/5/11/chartex" xmlns:cx6="http://schemas.microsoft.com/office/drawing/2016/5/12/chartex" xmlns:cx7="http://schemas.microsoft.com/office/drawing/2016/5/13/chartex" xmlns:cx8="http://schemas.microsoft.com/office/drawing/2016/5/14/chartex" xmlns:mc="http://schemas.openxmlformats.org/markup-compatibility/2006" xmlns:aink="http://schemas.microsoft.com/office/drawing/2016/ink" xmlns:am3d="http://schemas.microsoft.com/office/drawing/2017/model3d" xmlns:o="urn:schemas-microsoft-com:office:office" xmlns:r="http://schemas.openxmlformats.org/officeDocument/2006/relationships" xmlns:m="http://schemas.openxmlformats.org/officeDocument/2006/math" xmlns:v="urn:schemas-microsoft-com:vml" xmlns:wp14="http://schemas.microsoft.com/office/word/2010/wordprocessingDrawing" xmlns:wp="http://schemas.openxmlformats.org/drawingml/2006/wordprocessingDrawing" xmlns:w10="urn:schemas-microsoft-com:office:word" xmlns:w="http://schemas.openxmlformats.org/wordprocessingml/2006/main" xmlns:w14="http://schemas.microsoft.com/office/word/2010/wordml" xmlns:w15="http://schemas.microsoft.com/office/word/2012/wordml" xmlns:w16cid="http://schemas.microsoft.com/office/word/2016/wordml/cid" xmlns:w16se="http://schemas.microsoft.com/office/word/2015/wordml/symex" xmlns:wpg="http://schemas.microsoft.com/office/word/2010/wordprocessingGroup" xmlns:wpi="http://schemas.microsoft.com/office/word/2010/wordprocessingInk" xmlns:wne="http://schemas.microsoft.com/office/word/2006/wordml" xmlns:wps="http://schemas.microsoft.com/office/word/2010/wordprocessingShape" mc:Ignorable="w14 w15 w16se w16cid wp14">
   <w:body>
     <w:p>
       <w:pPr>
@@ -261,15 +261,7 @@
           <w:sz w:val="23"/>
           <w:szCs w:val="23"/>
         </w:rPr>
-        <w:t xml:space="preserve"> con el fin de suscribir un acuerdo provisto de las siguientes c</w:t>
-      </w:r>
-      <w:r>
-        <w:rPr>
-          <w:rFonts w:ascii="Calibri" w:eastAsia="Calibri" w:hAnsi="Calibri" w:cs="Calibri"/>
-          <w:sz w:val="23"/>
-          <w:szCs w:val="23"/>
-        </w:rPr>
-        <w:t>láusulas:</w:t>
+        <w:t xml:space="preserve"> con el fin de suscribir un acuerdo provisto de las siguientes cláusulas:</w:t>
       </w:r>
     </w:p>
     <w:p>
@@ -348,82 +340,10 @@
           <w:b/>
           <w:bCs/>
         </w:rPr>
-        <w:t>[[</w:t>
-      </w:r>
-      <w:proofErr w:type="spellStart"/>
-      <w:r>
-        <w:rPr>
-          <w:rFonts w:ascii="Calibri" w:eastAsia="Calibri" w:hAnsi="Calibri" w:cs="Calibri"/>
-          <w:b/>
-          <w:bCs/>
-        </w:rPr>
-        <w:t>SalarioLetras</w:t>
-      </w:r>
-      <w:proofErr w:type="spellEnd"/>
-      <w:r>
-        <w:rPr>
-          <w:rFonts w:ascii="Calibri" w:eastAsia="Calibri" w:hAnsi="Calibri" w:cs="Calibri"/>
-          <w:b/>
-          <w:bCs/>
-        </w:rPr>
-        <w:t>]]</w:t>
-      </w:r>
-      <w:r>
-        <w:rPr>
-          <w:rFonts w:ascii="Calibri" w:eastAsia="Calibri" w:hAnsi="Calibri" w:cs="Calibri"/>
-          <w:b/>
-          <w:bCs/>
-        </w:rPr>
-        <w:t xml:space="preserve"> MCTE</w:t>
-      </w:r>
-      <w:r>
-        <w:rPr>
-          <w:rFonts w:ascii="Calibri" w:eastAsia="Calibri" w:hAnsi="Calibri" w:cs="Calibri"/>
-          <w:b/>
-          <w:bCs/>
-        </w:rPr>
-        <w:t>.</w:t>
-      </w:r>
-      <w:r>
-        <w:rPr>
-          <w:rFonts w:ascii="Calibri" w:eastAsia="Calibri" w:hAnsi="Calibri" w:cs="Calibri"/>
-          <w:b/>
-          <w:bCs/>
-        </w:rPr>
-        <w:t xml:space="preserve"> </w:t>
-      </w:r>
-      <w:r>
-        <w:rPr>
-          <w:rFonts w:ascii="Calibri" w:eastAsia="Calibri" w:hAnsi="Calibri" w:cs="Calibri"/>
-          <w:b/>
-          <w:bCs/>
-        </w:rPr>
-        <w:t>(</w:t>
-      </w:r>
-      <w:r>
-        <w:rPr>
-          <w:rFonts w:ascii="Calibri" w:eastAsia="Calibri" w:hAnsi="Calibri" w:cs="Calibri"/>
-          <w:b/>
-          <w:bCs/>
-        </w:rPr>
-        <w:t>[[Salario]]</w:t>
-      </w:r>
-      <w:r>
-        <w:rPr>
-          <w:rFonts w:ascii="Calibri" w:eastAsia="Calibri" w:hAnsi="Calibri" w:cs="Calibri"/>
-          <w:b/>
-          <w:bCs/>
-        </w:rPr>
-        <w:t>)</w:t>
-      </w:r>
-      <w:r>
-        <w:rPr>
-          <w:rFonts w:ascii="Calibri" w:eastAsia="Calibri" w:hAnsi="Calibri" w:cs="Calibri"/>
-          <w:b/>
-          <w:bCs/>
-        </w:rPr>
-        <w:t xml:space="preserve"> </w:t>
-      </w:r>
+        <w:t xml:space="preserve">DIEZ MIL PESOS 00/100 MCTE. ($10.000,00) </w:t>
+      </w:r>
+      <w:bookmarkStart w:id="0" w:name="_GoBack"/>
+      <w:bookmarkEnd w:id="0"/>
       <w:r>
         <w:rPr>
           <w:rFonts w:ascii="Calibri" w:eastAsia="Calibri" w:hAnsi="Calibri" w:cs="Calibri"/>
@@ -471,23 +391,7 @@
           <w:sz w:val="23"/>
           <w:szCs w:val="23"/>
         </w:rPr>
-        <w:t xml:space="preserve"> Las partes convienen y así lo hacen constar</w:t>
-      </w:r>
-      <w:r>
-        <w:rPr>
-          <w:rFonts w:ascii="Calibri" w:eastAsia="Calibri" w:hAnsi="Calibri" w:cs="Calibri"/>
-          <w:sz w:val="23"/>
-          <w:szCs w:val="23"/>
-        </w:rPr>
-        <w:t xml:space="preserve"> que el beneficio extralegal que mediante este acuerdo se otorga, en tanto constituye un subsidio de alimentación que no tiene por finalidad retribuir de manera directa el servicio, no constituye salario para ningún efecto legal conforme a lo estipulado en</w:t>
-      </w:r>
-      <w:r>
-        <w:rPr>
-          <w:rFonts w:ascii="Calibri" w:eastAsia="Calibri" w:hAnsi="Calibri" w:cs="Calibri"/>
-          <w:sz w:val="23"/>
-          <w:szCs w:val="23"/>
-        </w:rPr>
-        <w:t xml:space="preserve"> el artículo 15 de la Ley 50 de 1990. </w:t>
+        <w:t xml:space="preserve"> Las partes convienen y así lo hacen constar que el beneficio extralegal que mediante este acuerdo se otorga, en tanto constituye un subsidio de alimentación que no tiene por finalidad retribuir de manera directa el servicio, no constituye salario para ningún efecto legal conforme a lo estipulado en el artículo 15 de la Ley 50 de 1990. </w:t>
       </w:r>
     </w:p>
     <w:p>
@@ -527,15 +431,7 @@
           <w:sz w:val="23"/>
           <w:szCs w:val="23"/>
         </w:rPr>
-        <w:t xml:space="preserve"> Las partes declaran y así lo hacen constar que el presente beneficio, en tanto deriva de la mera liberalidad de la empresa, podrá ser modificado o eliminado de manera unilateral por la compañía cuando las ne</w:t>
-      </w:r>
-      <w:r>
-        <w:rPr>
-          <w:rFonts w:ascii="Calibri" w:eastAsia="Calibri" w:hAnsi="Calibri" w:cs="Calibri"/>
-          <w:sz w:val="23"/>
-          <w:szCs w:val="23"/>
-        </w:rPr>
-        <w:t>cesidades así lo ameriten, sin que por ello se entienda desmejora en las condiciones del trabajador.</w:t>
+        <w:t xml:space="preserve"> Las partes declaran y así lo hacen constar que el presente beneficio, en tanto deriva de la mera liberalidad de la empresa, podrá ser modificado o eliminado de manera unilateral por la compañía cuando las necesidades así lo ameriten, sin que por ello se entienda desmejora en las condiciones del trabajador.</w:t>
       </w:r>
     </w:p>
     <w:p>
@@ -606,15 +502,7 @@
           <w:sz w:val="23"/>
           <w:szCs w:val="23"/>
         </w:rPr>
-        <w:t xml:space="preserve">En constancia se </w:t>
-      </w:r>
-      <w:r>
-        <w:rPr>
-          <w:rFonts w:ascii="Calibri" w:eastAsia="Calibri" w:hAnsi="Calibri" w:cs="Calibri"/>
-          <w:sz w:val="23"/>
-          <w:szCs w:val="23"/>
-        </w:rPr>
-        <w:t xml:space="preserve">firma en </w:t>
+        <w:t xml:space="preserve">En constancia se firma en </w:t>
       </w:r>
       <w:r>
         <w:rPr>
@@ -912,13 +800,6 @@
           <w:szCs w:val="23"/>
         </w:rPr>
         <w:tab/>
-      </w:r>
-      <w:r>
-        <w:rPr>
-          <w:rFonts w:ascii="Calibri" w:eastAsia="Calibri" w:hAnsi="Calibri" w:cs="Calibri"/>
-          <w:sz w:val="23"/>
-          <w:szCs w:val="23"/>
-        </w:rPr>
         <w:t>C.C</w:t>
       </w:r>
       <w:proofErr w:type="gramEnd"/>
@@ -979,7 +860,7 @@
 </file>
 
 <file path=word/styles.xml><?xml version="1.0" encoding="utf-8"?>
-<w:styles xmlns:mc="http://schemas.openxmlformats.org/markup-compatibility/2006" xmlns:r="http://schemas.openxmlformats.org/officeDocument/2006/relationships" xmlns:w="http://schemas.openxmlformats.org/wordprocessingml/2006/main" xmlns:w14="http://schemas.microsoft.com/office/word/2010/wordml" xmlns:w15="http://schemas.microsoft.com/office/word/2012/wordml" xmlns:w16cex="http://schemas.microsoft.com/office/word/2018/wordml/cex" xmlns:w16cid="http://schemas.microsoft.com/office/word/2016/wordml/cid" xmlns:w16="http://schemas.microsoft.com/office/word/2018/wordml" xmlns:w16sdtdh="http://schemas.microsoft.com/office/word/2020/wordml/sdtdatahash" xmlns:w16se="http://schemas.microsoft.com/office/word/2015/wordml/symex" mc:Ignorable="w14 w15 w16se w16cid w16 w16cex w16sdtdh">
+<w:styles xmlns:mc="http://schemas.openxmlformats.org/markup-compatibility/2006" xmlns:r="http://schemas.openxmlformats.org/officeDocument/2006/relationships" xmlns:w="http://schemas.openxmlformats.org/wordprocessingml/2006/main" xmlns:w14="http://schemas.microsoft.com/office/word/2010/wordml" xmlns:w15="http://schemas.microsoft.com/office/word/2012/wordml" xmlns:w16cid="http://schemas.microsoft.com/office/word/2016/wordml/cid" xmlns:w16se="http://schemas.microsoft.com/office/word/2015/wordml/symex" mc:Ignorable="w14 w15 w16se w16cid">
   <w:docDefaults>
     <w:rPrDefault>
       <w:rPr>
@@ -995,7 +876,7 @@
       </w:pPr>
     </w:pPrDefault>
   </w:docDefaults>
-  <w:latentStyles w:defLockedState="0" w:defUIPriority="99" w:defSemiHidden="0" w:defUnhideWhenUsed="0" w:defQFormat="0" w:count="376">
+  <w:latentStyles w:defLockedState="0" w:defUIPriority="99" w:defSemiHidden="0" w:defUnhideWhenUsed="0" w:defQFormat="0" w:count="375">
     <w:lsdException w:name="Normal" w:uiPriority="0" w:qFormat="1"/>
     <w:lsdException w:name="heading 1" w:uiPriority="9" w:qFormat="1"/>
     <w:lsdException w:name="heading 2" w:semiHidden="1" w:uiPriority="9" w:unhideWhenUsed="1" w:qFormat="1"/>
@@ -1371,7 +1252,6 @@
     <w:lsdException w:name="Smart Hyperlink" w:semiHidden="1" w:unhideWhenUsed="1"/>
     <w:lsdException w:name="Hashtag" w:semiHidden="1" w:unhideWhenUsed="1"/>
     <w:lsdException w:name="Unresolved Mention" w:semiHidden="1" w:unhideWhenUsed="1"/>
-    <w:lsdException w:name="Smart Link" w:semiHidden="1" w:unhideWhenUsed="1"/>
   </w:latentStyles>
   <w:style w:type="paragraph" w:default="1" w:styleId="Normal">
     <w:name w:val="Normal"/>

</xml_diff>